<commit_message>
Welt 3: Tracetabellen nur mit Variablen, Codestellen markiert (AB 3, LSG, Folie 25)
Bedingungsspalten entfernt (verschmelze, zerlege-Beispiel, Aufgabe 5a), Spalte r[i] gestrichen
(steht in „Reihung danach“), Marker „// → Tabellenzeile“ auf Folie 25.

Co-Authored-By: Claude Opus 5.5 <noreply@anthropic.com>
Claude-Session: https://claude.ai/code/session_01CemoEYGRdCe5FszEBVFFUP
</commit_message>
<xml_diff>
--- a/materialien/Welt3_Labyrinth/2_Arbeitsblaetter/AQ_W3_AB3_Teile_und_herrsche.docx
+++ b/materialien/Welt3_Labyrinth/2_Arbeitsblaetter/AQ_W3_AB3_Teile_und_herrsche.docx
@@ -6916,7 +6916,7 @@
                 <w:sz w:val="22"/>
                 <w:szCs w:val="22"/>
               </w:rPr>
-              <w:t xml:space="preserve"> in einer Tracetabelle. i, j und k sind die Positionen in a, b und im Ergebnis; erste Zeile: Zustand vor der Schleife.</w:t>
+              <w:t xml:space="preserve"> in einer Tracetabelle. i, j und k sind die Positionen in a, b und im Ergebnis. Eine Zeile vor der Schleife (Startwerte), danach eine Zeile nach jedem übernommenen Element – auch beim Anhängen des Rests.</w:t>
             </w:r>
           </w:p>
         </w:tc>
@@ -6970,11 +6970,10 @@
         <w:tblLayout w:type="fixed"/>
       </w:tblPr>
       <w:tblGrid>
-        <w:gridCol w:w="771"/>
-        <w:gridCol w:w="771"/>
-        <w:gridCol w:w="771"/>
-        <w:gridCol w:w="3084"/>
-        <w:gridCol w:w="4241"/>
+        <w:gridCol w:w="1134"/>
+        <w:gridCol w:w="1134"/>
+        <w:gridCol w:w="1134"/>
+        <w:gridCol w:w="6237"/>
       </w:tblGrid>
       <w:tr>
         <w:trPr>
@@ -6983,7 +6982,7 @@
         </w:trPr>
         <w:tc>
           <w:tcPr>
-            <w:tcW w:type="dxa" w:w="771"/>
+            <w:tcW w:type="dxa" w:w="1134"/>
             <w:shd w:fill="1F4E79" w:color="auto" w:val="clear"/>
             <w:tcMar>
               <w:top w:type="dxa" w:w="50"/>
@@ -7014,7 +7013,7 @@
         </w:tc>
         <w:tc>
           <w:tcPr>
-            <w:tcW w:type="dxa" w:w="771"/>
+            <w:tcW w:type="dxa" w:w="1134"/>
             <w:shd w:fill="1F4E79" w:color="auto" w:val="clear"/>
             <w:tcMar>
               <w:top w:type="dxa" w:w="50"/>
@@ -7045,7 +7044,7 @@
         </w:tc>
         <w:tc>
           <w:tcPr>
-            <w:tcW w:type="dxa" w:w="771"/>
+            <w:tcW w:type="dxa" w:w="1134"/>
             <w:shd w:fill="1F4E79" w:color="auto" w:val="clear"/>
             <w:tcMar>
               <w:top w:type="dxa" w:w="50"/>
@@ -7076,38 +7075,7 @@
         </w:tc>
         <w:tc>
           <w:tcPr>
-            <w:tcW w:type="dxa" w:w="3084"/>
-            <w:shd w:fill="1F4E79" w:color="auto" w:val="clear"/>
-            <w:tcMar>
-              <w:top w:type="dxa" w:w="50"/>
-              <w:left w:type="dxa" w:w="100"/>
-              <w:bottom w:type="dxa" w:w="50"/>
-              <w:right w:type="dxa" w:w="100"/>
-            </w:tcMar>
-            <w:vAlign w:val="center"/>
-          </w:tcPr>
-          <w:p>
-            <w:pPr>
-              <w:keepNext/>
-              <w:spacing w:after="0" w:line="252"/>
-              <w:jc w:val="center"/>
-            </w:pPr>
-            <w:r>
-              <w:rPr>
-                <w:rFonts w:ascii="Calibri" w:cs="Calibri" w:eastAsia="Calibri" w:hAnsi="Calibri"/>
-                <w:b/>
-                <w:bCs/>
-                <w:color w:val="FFFFFF"/>
-                <w:sz w:val="19"/>
-                <w:szCs w:val="19"/>
-              </w:rPr>
-              <w:t xml:space="preserve">Vergleich a[i] ≤ b[j]?</w:t>
-            </w:r>
-          </w:p>
-        </w:tc>
-        <w:tc>
-          <w:tcPr>
-            <w:tcW w:type="dxa" w:w="4241"/>
+            <w:tcW w:type="dxa" w:w="6237"/>
             <w:shd w:fill="1F4E79" w:color="auto" w:val="clear"/>
             <w:tcMar>
               <w:top w:type="dxa" w:w="50"/>
@@ -7144,7 +7112,7 @@
         </w:trPr>
         <w:tc>
           <w:tcPr>
-            <w:tcW w:type="dxa" w:w="771"/>
+            <w:tcW w:type="dxa" w:w="1134"/>
             <w:tcMar>
               <w:top w:type="dxa" w:w="50"/>
               <w:left w:type="dxa" w:w="100"/>
@@ -7172,64 +7140,45 @@
         </w:tc>
         <w:tc>
           <w:tcPr>
-            <w:tcW w:type="dxa" w:w="771"/>
-            <w:tcMar>
-              <w:top w:type="dxa" w:w="50"/>
-              <w:left w:type="dxa" w:w="100"/>
-              <w:bottom w:type="dxa" w:w="50"/>
-              <w:right w:type="dxa" w:w="100"/>
-            </w:tcMar>
-            <w:vAlign w:val="center"/>
-          </w:tcPr>
-          <w:p>
-            <w:pPr>
-              <w:keepNext/>
-              <w:spacing w:after="0" w:line="252"/>
-              <w:jc w:val="center"/>
-            </w:pPr>
-          </w:p>
-        </w:tc>
-        <w:tc>
-          <w:tcPr>
-            <w:tcW w:type="dxa" w:w="771"/>
-            <w:tcMar>
-              <w:top w:type="dxa" w:w="50"/>
-              <w:left w:type="dxa" w:w="100"/>
-              <w:bottom w:type="dxa" w:w="50"/>
-              <w:right w:type="dxa" w:w="100"/>
-            </w:tcMar>
-            <w:vAlign w:val="center"/>
-          </w:tcPr>
-          <w:p>
-            <w:pPr>
-              <w:keepNext/>
-              <w:spacing w:after="0" w:line="252"/>
-              <w:jc w:val="center"/>
-            </w:pPr>
-          </w:p>
-        </w:tc>
-        <w:tc>
-          <w:tcPr>
-            <w:tcW w:type="dxa" w:w="3084"/>
-            <w:tcMar>
-              <w:top w:type="dxa" w:w="50"/>
-              <w:left w:type="dxa" w:w="100"/>
-              <w:bottom w:type="dxa" w:w="50"/>
-              <w:right w:type="dxa" w:w="100"/>
-            </w:tcMar>
-            <w:vAlign w:val="center"/>
-          </w:tcPr>
-          <w:p>
-            <w:pPr>
-              <w:keepNext/>
-              <w:spacing w:after="0" w:line="252"/>
-              <w:jc w:val="center"/>
-            </w:pPr>
-          </w:p>
-        </w:tc>
-        <w:tc>
-          <w:tcPr>
-            <w:tcW w:type="dxa" w:w="4241"/>
+            <w:tcW w:type="dxa" w:w="1134"/>
+            <w:tcMar>
+              <w:top w:type="dxa" w:w="50"/>
+              <w:left w:type="dxa" w:w="100"/>
+              <w:bottom w:type="dxa" w:w="50"/>
+              <w:right w:type="dxa" w:w="100"/>
+            </w:tcMar>
+            <w:vAlign w:val="center"/>
+          </w:tcPr>
+          <w:p>
+            <w:pPr>
+              <w:keepNext/>
+              <w:spacing w:after="0" w:line="252"/>
+              <w:jc w:val="center"/>
+            </w:pPr>
+          </w:p>
+        </w:tc>
+        <w:tc>
+          <w:tcPr>
+            <w:tcW w:type="dxa" w:w="1134"/>
+            <w:tcMar>
+              <w:top w:type="dxa" w:w="50"/>
+              <w:left w:type="dxa" w:w="100"/>
+              <w:bottom w:type="dxa" w:w="50"/>
+              <w:right w:type="dxa" w:w="100"/>
+            </w:tcMar>
+            <w:vAlign w:val="center"/>
+          </w:tcPr>
+          <w:p>
+            <w:pPr>
+              <w:keepNext/>
+              <w:spacing w:after="0" w:line="252"/>
+              <w:jc w:val="center"/>
+            </w:pPr>
+          </w:p>
+        </w:tc>
+        <w:tc>
+          <w:tcPr>
+            <w:tcW w:type="dxa" w:w="6237"/>
             <w:tcMar>
               <w:top w:type="dxa" w:w="50"/>
               <w:left w:type="dxa" w:w="100"/>
@@ -7254,83 +7203,64 @@
         </w:trPr>
         <w:tc>
           <w:tcPr>
-            <w:tcW w:type="dxa" w:w="771"/>
-            <w:tcMar>
-              <w:top w:type="dxa" w:w="50"/>
-              <w:left w:type="dxa" w:w="100"/>
-              <w:bottom w:type="dxa" w:w="50"/>
-              <w:right w:type="dxa" w:w="100"/>
-            </w:tcMar>
-            <w:vAlign w:val="center"/>
-          </w:tcPr>
-          <w:p>
-            <w:pPr>
-              <w:keepNext/>
-              <w:spacing w:after="0" w:line="252"/>
-              <w:jc w:val="center"/>
-            </w:pPr>
-          </w:p>
-        </w:tc>
-        <w:tc>
-          <w:tcPr>
-            <w:tcW w:type="dxa" w:w="771"/>
-            <w:tcMar>
-              <w:top w:type="dxa" w:w="50"/>
-              <w:left w:type="dxa" w:w="100"/>
-              <w:bottom w:type="dxa" w:w="50"/>
-              <w:right w:type="dxa" w:w="100"/>
-            </w:tcMar>
-            <w:vAlign w:val="center"/>
-          </w:tcPr>
-          <w:p>
-            <w:pPr>
-              <w:keepNext/>
-              <w:spacing w:after="0" w:line="252"/>
-              <w:jc w:val="center"/>
-            </w:pPr>
-          </w:p>
-        </w:tc>
-        <w:tc>
-          <w:tcPr>
-            <w:tcW w:type="dxa" w:w="771"/>
-            <w:tcMar>
-              <w:top w:type="dxa" w:w="50"/>
-              <w:left w:type="dxa" w:w="100"/>
-              <w:bottom w:type="dxa" w:w="50"/>
-              <w:right w:type="dxa" w:w="100"/>
-            </w:tcMar>
-            <w:vAlign w:val="center"/>
-          </w:tcPr>
-          <w:p>
-            <w:pPr>
-              <w:keepNext/>
-              <w:spacing w:after="0" w:line="252"/>
-              <w:jc w:val="center"/>
-            </w:pPr>
-          </w:p>
-        </w:tc>
-        <w:tc>
-          <w:tcPr>
-            <w:tcW w:type="dxa" w:w="3084"/>
-            <w:tcMar>
-              <w:top w:type="dxa" w:w="50"/>
-              <w:left w:type="dxa" w:w="100"/>
-              <w:bottom w:type="dxa" w:w="50"/>
-              <w:right w:type="dxa" w:w="100"/>
-            </w:tcMar>
-            <w:vAlign w:val="center"/>
-          </w:tcPr>
-          <w:p>
-            <w:pPr>
-              <w:keepNext/>
-              <w:spacing w:after="0" w:line="252"/>
-              <w:jc w:val="center"/>
-            </w:pPr>
-          </w:p>
-        </w:tc>
-        <w:tc>
-          <w:tcPr>
-            <w:tcW w:type="dxa" w:w="4241"/>
+            <w:tcW w:type="dxa" w:w="1134"/>
+            <w:tcMar>
+              <w:top w:type="dxa" w:w="50"/>
+              <w:left w:type="dxa" w:w="100"/>
+              <w:bottom w:type="dxa" w:w="50"/>
+              <w:right w:type="dxa" w:w="100"/>
+            </w:tcMar>
+            <w:vAlign w:val="center"/>
+          </w:tcPr>
+          <w:p>
+            <w:pPr>
+              <w:keepNext/>
+              <w:spacing w:after="0" w:line="252"/>
+              <w:jc w:val="center"/>
+            </w:pPr>
+          </w:p>
+        </w:tc>
+        <w:tc>
+          <w:tcPr>
+            <w:tcW w:type="dxa" w:w="1134"/>
+            <w:tcMar>
+              <w:top w:type="dxa" w:w="50"/>
+              <w:left w:type="dxa" w:w="100"/>
+              <w:bottom w:type="dxa" w:w="50"/>
+              <w:right w:type="dxa" w:w="100"/>
+            </w:tcMar>
+            <w:vAlign w:val="center"/>
+          </w:tcPr>
+          <w:p>
+            <w:pPr>
+              <w:keepNext/>
+              <w:spacing w:after="0" w:line="252"/>
+              <w:jc w:val="center"/>
+            </w:pPr>
+          </w:p>
+        </w:tc>
+        <w:tc>
+          <w:tcPr>
+            <w:tcW w:type="dxa" w:w="1134"/>
+            <w:tcMar>
+              <w:top w:type="dxa" w:w="50"/>
+              <w:left w:type="dxa" w:w="100"/>
+              <w:bottom w:type="dxa" w:w="50"/>
+              <w:right w:type="dxa" w:w="100"/>
+            </w:tcMar>
+            <w:vAlign w:val="center"/>
+          </w:tcPr>
+          <w:p>
+            <w:pPr>
+              <w:keepNext/>
+              <w:spacing w:after="0" w:line="252"/>
+              <w:jc w:val="center"/>
+            </w:pPr>
+          </w:p>
+        </w:tc>
+        <w:tc>
+          <w:tcPr>
+            <w:tcW w:type="dxa" w:w="6237"/>
             <w:tcMar>
               <w:top w:type="dxa" w:w="50"/>
               <w:left w:type="dxa" w:w="100"/>
@@ -7355,83 +7285,64 @@
         </w:trPr>
         <w:tc>
           <w:tcPr>
-            <w:tcW w:type="dxa" w:w="771"/>
-            <w:tcMar>
-              <w:top w:type="dxa" w:w="50"/>
-              <w:left w:type="dxa" w:w="100"/>
-              <w:bottom w:type="dxa" w:w="50"/>
-              <w:right w:type="dxa" w:w="100"/>
-            </w:tcMar>
-            <w:vAlign w:val="center"/>
-          </w:tcPr>
-          <w:p>
-            <w:pPr>
-              <w:keepNext/>
-              <w:spacing w:after="0" w:line="252"/>
-              <w:jc w:val="center"/>
-            </w:pPr>
-          </w:p>
-        </w:tc>
-        <w:tc>
-          <w:tcPr>
-            <w:tcW w:type="dxa" w:w="771"/>
-            <w:tcMar>
-              <w:top w:type="dxa" w:w="50"/>
-              <w:left w:type="dxa" w:w="100"/>
-              <w:bottom w:type="dxa" w:w="50"/>
-              <w:right w:type="dxa" w:w="100"/>
-            </w:tcMar>
-            <w:vAlign w:val="center"/>
-          </w:tcPr>
-          <w:p>
-            <w:pPr>
-              <w:keepNext/>
-              <w:spacing w:after="0" w:line="252"/>
-              <w:jc w:val="center"/>
-            </w:pPr>
-          </w:p>
-        </w:tc>
-        <w:tc>
-          <w:tcPr>
-            <w:tcW w:type="dxa" w:w="771"/>
-            <w:tcMar>
-              <w:top w:type="dxa" w:w="50"/>
-              <w:left w:type="dxa" w:w="100"/>
-              <w:bottom w:type="dxa" w:w="50"/>
-              <w:right w:type="dxa" w:w="100"/>
-            </w:tcMar>
-            <w:vAlign w:val="center"/>
-          </w:tcPr>
-          <w:p>
-            <w:pPr>
-              <w:keepNext/>
-              <w:spacing w:after="0" w:line="252"/>
-              <w:jc w:val="center"/>
-            </w:pPr>
-          </w:p>
-        </w:tc>
-        <w:tc>
-          <w:tcPr>
-            <w:tcW w:type="dxa" w:w="3084"/>
-            <w:tcMar>
-              <w:top w:type="dxa" w:w="50"/>
-              <w:left w:type="dxa" w:w="100"/>
-              <w:bottom w:type="dxa" w:w="50"/>
-              <w:right w:type="dxa" w:w="100"/>
-            </w:tcMar>
-            <w:vAlign w:val="center"/>
-          </w:tcPr>
-          <w:p>
-            <w:pPr>
-              <w:keepNext/>
-              <w:spacing w:after="0" w:line="252"/>
-              <w:jc w:val="center"/>
-            </w:pPr>
-          </w:p>
-        </w:tc>
-        <w:tc>
-          <w:tcPr>
-            <w:tcW w:type="dxa" w:w="4241"/>
+            <w:tcW w:type="dxa" w:w="1134"/>
+            <w:tcMar>
+              <w:top w:type="dxa" w:w="50"/>
+              <w:left w:type="dxa" w:w="100"/>
+              <w:bottom w:type="dxa" w:w="50"/>
+              <w:right w:type="dxa" w:w="100"/>
+            </w:tcMar>
+            <w:vAlign w:val="center"/>
+          </w:tcPr>
+          <w:p>
+            <w:pPr>
+              <w:keepNext/>
+              <w:spacing w:after="0" w:line="252"/>
+              <w:jc w:val="center"/>
+            </w:pPr>
+          </w:p>
+        </w:tc>
+        <w:tc>
+          <w:tcPr>
+            <w:tcW w:type="dxa" w:w="1134"/>
+            <w:tcMar>
+              <w:top w:type="dxa" w:w="50"/>
+              <w:left w:type="dxa" w:w="100"/>
+              <w:bottom w:type="dxa" w:w="50"/>
+              <w:right w:type="dxa" w:w="100"/>
+            </w:tcMar>
+            <w:vAlign w:val="center"/>
+          </w:tcPr>
+          <w:p>
+            <w:pPr>
+              <w:keepNext/>
+              <w:spacing w:after="0" w:line="252"/>
+              <w:jc w:val="center"/>
+            </w:pPr>
+          </w:p>
+        </w:tc>
+        <w:tc>
+          <w:tcPr>
+            <w:tcW w:type="dxa" w:w="1134"/>
+            <w:tcMar>
+              <w:top w:type="dxa" w:w="50"/>
+              <w:left w:type="dxa" w:w="100"/>
+              <w:bottom w:type="dxa" w:w="50"/>
+              <w:right w:type="dxa" w:w="100"/>
+            </w:tcMar>
+            <w:vAlign w:val="center"/>
+          </w:tcPr>
+          <w:p>
+            <w:pPr>
+              <w:keepNext/>
+              <w:spacing w:after="0" w:line="252"/>
+              <w:jc w:val="center"/>
+            </w:pPr>
+          </w:p>
+        </w:tc>
+        <w:tc>
+          <w:tcPr>
+            <w:tcW w:type="dxa" w:w="6237"/>
             <w:tcMar>
               <w:top w:type="dxa" w:w="50"/>
               <w:left w:type="dxa" w:w="100"/>
@@ -7456,83 +7367,64 @@
         </w:trPr>
         <w:tc>
           <w:tcPr>
-            <w:tcW w:type="dxa" w:w="771"/>
-            <w:tcMar>
-              <w:top w:type="dxa" w:w="50"/>
-              <w:left w:type="dxa" w:w="100"/>
-              <w:bottom w:type="dxa" w:w="50"/>
-              <w:right w:type="dxa" w:w="100"/>
-            </w:tcMar>
-            <w:vAlign w:val="center"/>
-          </w:tcPr>
-          <w:p>
-            <w:pPr>
-              <w:keepNext/>
-              <w:spacing w:after="0" w:line="252"/>
-              <w:jc w:val="center"/>
-            </w:pPr>
-          </w:p>
-        </w:tc>
-        <w:tc>
-          <w:tcPr>
-            <w:tcW w:type="dxa" w:w="771"/>
-            <w:tcMar>
-              <w:top w:type="dxa" w:w="50"/>
-              <w:left w:type="dxa" w:w="100"/>
-              <w:bottom w:type="dxa" w:w="50"/>
-              <w:right w:type="dxa" w:w="100"/>
-            </w:tcMar>
-            <w:vAlign w:val="center"/>
-          </w:tcPr>
-          <w:p>
-            <w:pPr>
-              <w:keepNext/>
-              <w:spacing w:after="0" w:line="252"/>
-              <w:jc w:val="center"/>
-            </w:pPr>
-          </w:p>
-        </w:tc>
-        <w:tc>
-          <w:tcPr>
-            <w:tcW w:type="dxa" w:w="771"/>
-            <w:tcMar>
-              <w:top w:type="dxa" w:w="50"/>
-              <w:left w:type="dxa" w:w="100"/>
-              <w:bottom w:type="dxa" w:w="50"/>
-              <w:right w:type="dxa" w:w="100"/>
-            </w:tcMar>
-            <w:vAlign w:val="center"/>
-          </w:tcPr>
-          <w:p>
-            <w:pPr>
-              <w:keepNext/>
-              <w:spacing w:after="0" w:line="252"/>
-              <w:jc w:val="center"/>
-            </w:pPr>
-          </w:p>
-        </w:tc>
-        <w:tc>
-          <w:tcPr>
-            <w:tcW w:type="dxa" w:w="3084"/>
-            <w:tcMar>
-              <w:top w:type="dxa" w:w="50"/>
-              <w:left w:type="dxa" w:w="100"/>
-              <w:bottom w:type="dxa" w:w="50"/>
-              <w:right w:type="dxa" w:w="100"/>
-            </w:tcMar>
-            <w:vAlign w:val="center"/>
-          </w:tcPr>
-          <w:p>
-            <w:pPr>
-              <w:keepNext/>
-              <w:spacing w:after="0" w:line="252"/>
-              <w:jc w:val="center"/>
-            </w:pPr>
-          </w:p>
-        </w:tc>
-        <w:tc>
-          <w:tcPr>
-            <w:tcW w:type="dxa" w:w="4241"/>
+            <w:tcW w:type="dxa" w:w="1134"/>
+            <w:tcMar>
+              <w:top w:type="dxa" w:w="50"/>
+              <w:left w:type="dxa" w:w="100"/>
+              <w:bottom w:type="dxa" w:w="50"/>
+              <w:right w:type="dxa" w:w="100"/>
+            </w:tcMar>
+            <w:vAlign w:val="center"/>
+          </w:tcPr>
+          <w:p>
+            <w:pPr>
+              <w:keepNext/>
+              <w:spacing w:after="0" w:line="252"/>
+              <w:jc w:val="center"/>
+            </w:pPr>
+          </w:p>
+        </w:tc>
+        <w:tc>
+          <w:tcPr>
+            <w:tcW w:type="dxa" w:w="1134"/>
+            <w:tcMar>
+              <w:top w:type="dxa" w:w="50"/>
+              <w:left w:type="dxa" w:w="100"/>
+              <w:bottom w:type="dxa" w:w="50"/>
+              <w:right w:type="dxa" w:w="100"/>
+            </w:tcMar>
+            <w:vAlign w:val="center"/>
+          </w:tcPr>
+          <w:p>
+            <w:pPr>
+              <w:keepNext/>
+              <w:spacing w:after="0" w:line="252"/>
+              <w:jc w:val="center"/>
+            </w:pPr>
+          </w:p>
+        </w:tc>
+        <w:tc>
+          <w:tcPr>
+            <w:tcW w:type="dxa" w:w="1134"/>
+            <w:tcMar>
+              <w:top w:type="dxa" w:w="50"/>
+              <w:left w:type="dxa" w:w="100"/>
+              <w:bottom w:type="dxa" w:w="50"/>
+              <w:right w:type="dxa" w:w="100"/>
+            </w:tcMar>
+            <w:vAlign w:val="center"/>
+          </w:tcPr>
+          <w:p>
+            <w:pPr>
+              <w:keepNext/>
+              <w:spacing w:after="0" w:line="252"/>
+              <w:jc w:val="center"/>
+            </w:pPr>
+          </w:p>
+        </w:tc>
+        <w:tc>
+          <w:tcPr>
+            <w:tcW w:type="dxa" w:w="6237"/>
             <w:tcMar>
               <w:top w:type="dxa" w:w="50"/>
               <w:left w:type="dxa" w:w="100"/>
@@ -7557,83 +7449,64 @@
         </w:trPr>
         <w:tc>
           <w:tcPr>
-            <w:tcW w:type="dxa" w:w="771"/>
-            <w:tcMar>
-              <w:top w:type="dxa" w:w="50"/>
-              <w:left w:type="dxa" w:w="100"/>
-              <w:bottom w:type="dxa" w:w="50"/>
-              <w:right w:type="dxa" w:w="100"/>
-            </w:tcMar>
-            <w:vAlign w:val="center"/>
-          </w:tcPr>
-          <w:p>
-            <w:pPr>
-              <w:keepNext/>
-              <w:spacing w:after="0" w:line="252"/>
-              <w:jc w:val="center"/>
-            </w:pPr>
-          </w:p>
-        </w:tc>
-        <w:tc>
-          <w:tcPr>
-            <w:tcW w:type="dxa" w:w="771"/>
-            <w:tcMar>
-              <w:top w:type="dxa" w:w="50"/>
-              <w:left w:type="dxa" w:w="100"/>
-              <w:bottom w:type="dxa" w:w="50"/>
-              <w:right w:type="dxa" w:w="100"/>
-            </w:tcMar>
-            <w:vAlign w:val="center"/>
-          </w:tcPr>
-          <w:p>
-            <w:pPr>
-              <w:keepNext/>
-              <w:spacing w:after="0" w:line="252"/>
-              <w:jc w:val="center"/>
-            </w:pPr>
-          </w:p>
-        </w:tc>
-        <w:tc>
-          <w:tcPr>
-            <w:tcW w:type="dxa" w:w="771"/>
-            <w:tcMar>
-              <w:top w:type="dxa" w:w="50"/>
-              <w:left w:type="dxa" w:w="100"/>
-              <w:bottom w:type="dxa" w:w="50"/>
-              <w:right w:type="dxa" w:w="100"/>
-            </w:tcMar>
-            <w:vAlign w:val="center"/>
-          </w:tcPr>
-          <w:p>
-            <w:pPr>
-              <w:keepNext/>
-              <w:spacing w:after="0" w:line="252"/>
-              <w:jc w:val="center"/>
-            </w:pPr>
-          </w:p>
-        </w:tc>
-        <w:tc>
-          <w:tcPr>
-            <w:tcW w:type="dxa" w:w="3084"/>
-            <w:tcMar>
-              <w:top w:type="dxa" w:w="50"/>
-              <w:left w:type="dxa" w:w="100"/>
-              <w:bottom w:type="dxa" w:w="50"/>
-              <w:right w:type="dxa" w:w="100"/>
-            </w:tcMar>
-            <w:vAlign w:val="center"/>
-          </w:tcPr>
-          <w:p>
-            <w:pPr>
-              <w:keepNext/>
-              <w:spacing w:after="0" w:line="252"/>
-              <w:jc w:val="center"/>
-            </w:pPr>
-          </w:p>
-        </w:tc>
-        <w:tc>
-          <w:tcPr>
-            <w:tcW w:type="dxa" w:w="4241"/>
+            <w:tcW w:type="dxa" w:w="1134"/>
+            <w:tcMar>
+              <w:top w:type="dxa" w:w="50"/>
+              <w:left w:type="dxa" w:w="100"/>
+              <w:bottom w:type="dxa" w:w="50"/>
+              <w:right w:type="dxa" w:w="100"/>
+            </w:tcMar>
+            <w:vAlign w:val="center"/>
+          </w:tcPr>
+          <w:p>
+            <w:pPr>
+              <w:keepNext/>
+              <w:spacing w:after="0" w:line="252"/>
+              <w:jc w:val="center"/>
+            </w:pPr>
+          </w:p>
+        </w:tc>
+        <w:tc>
+          <w:tcPr>
+            <w:tcW w:type="dxa" w:w="1134"/>
+            <w:tcMar>
+              <w:top w:type="dxa" w:w="50"/>
+              <w:left w:type="dxa" w:w="100"/>
+              <w:bottom w:type="dxa" w:w="50"/>
+              <w:right w:type="dxa" w:w="100"/>
+            </w:tcMar>
+            <w:vAlign w:val="center"/>
+          </w:tcPr>
+          <w:p>
+            <w:pPr>
+              <w:keepNext/>
+              <w:spacing w:after="0" w:line="252"/>
+              <w:jc w:val="center"/>
+            </w:pPr>
+          </w:p>
+        </w:tc>
+        <w:tc>
+          <w:tcPr>
+            <w:tcW w:type="dxa" w:w="1134"/>
+            <w:tcMar>
+              <w:top w:type="dxa" w:w="50"/>
+              <w:left w:type="dxa" w:w="100"/>
+              <w:bottom w:type="dxa" w:w="50"/>
+              <w:right w:type="dxa" w:w="100"/>
+            </w:tcMar>
+            <w:vAlign w:val="center"/>
+          </w:tcPr>
+          <w:p>
+            <w:pPr>
+              <w:keepNext/>
+              <w:spacing w:after="0" w:line="252"/>
+              <w:jc w:val="center"/>
+            </w:pPr>
+          </w:p>
+        </w:tc>
+        <w:tc>
+          <w:tcPr>
+            <w:tcW w:type="dxa" w:w="6237"/>
             <w:tcMar>
               <w:top w:type="dxa" w:w="50"/>
               <w:left w:type="dxa" w:w="100"/>
@@ -7658,83 +7531,64 @@
         </w:trPr>
         <w:tc>
           <w:tcPr>
-            <w:tcW w:type="dxa" w:w="771"/>
-            <w:tcMar>
-              <w:top w:type="dxa" w:w="50"/>
-              <w:left w:type="dxa" w:w="100"/>
-              <w:bottom w:type="dxa" w:w="50"/>
-              <w:right w:type="dxa" w:w="100"/>
-            </w:tcMar>
-            <w:vAlign w:val="center"/>
-          </w:tcPr>
-          <w:p>
-            <w:pPr>
-              <w:keepNext/>
-              <w:spacing w:after="0" w:line="252"/>
-              <w:jc w:val="center"/>
-            </w:pPr>
-          </w:p>
-        </w:tc>
-        <w:tc>
-          <w:tcPr>
-            <w:tcW w:type="dxa" w:w="771"/>
-            <w:tcMar>
-              <w:top w:type="dxa" w:w="50"/>
-              <w:left w:type="dxa" w:w="100"/>
-              <w:bottom w:type="dxa" w:w="50"/>
-              <w:right w:type="dxa" w:w="100"/>
-            </w:tcMar>
-            <w:vAlign w:val="center"/>
-          </w:tcPr>
-          <w:p>
-            <w:pPr>
-              <w:keepNext/>
-              <w:spacing w:after="0" w:line="252"/>
-              <w:jc w:val="center"/>
-            </w:pPr>
-          </w:p>
-        </w:tc>
-        <w:tc>
-          <w:tcPr>
-            <w:tcW w:type="dxa" w:w="771"/>
-            <w:tcMar>
-              <w:top w:type="dxa" w:w="50"/>
-              <w:left w:type="dxa" w:w="100"/>
-              <w:bottom w:type="dxa" w:w="50"/>
-              <w:right w:type="dxa" w:w="100"/>
-            </w:tcMar>
-            <w:vAlign w:val="center"/>
-          </w:tcPr>
-          <w:p>
-            <w:pPr>
-              <w:keepNext/>
-              <w:spacing w:after="0" w:line="252"/>
-              <w:jc w:val="center"/>
-            </w:pPr>
-          </w:p>
-        </w:tc>
-        <w:tc>
-          <w:tcPr>
-            <w:tcW w:type="dxa" w:w="3084"/>
-            <w:tcMar>
-              <w:top w:type="dxa" w:w="50"/>
-              <w:left w:type="dxa" w:w="100"/>
-              <w:bottom w:type="dxa" w:w="50"/>
-              <w:right w:type="dxa" w:w="100"/>
-            </w:tcMar>
-            <w:vAlign w:val="center"/>
-          </w:tcPr>
-          <w:p>
-            <w:pPr>
-              <w:keepNext/>
-              <w:spacing w:after="0" w:line="252"/>
-              <w:jc w:val="center"/>
-            </w:pPr>
-          </w:p>
-        </w:tc>
-        <w:tc>
-          <w:tcPr>
-            <w:tcW w:type="dxa" w:w="4241"/>
+            <w:tcW w:type="dxa" w:w="1134"/>
+            <w:tcMar>
+              <w:top w:type="dxa" w:w="50"/>
+              <w:left w:type="dxa" w:w="100"/>
+              <w:bottom w:type="dxa" w:w="50"/>
+              <w:right w:type="dxa" w:w="100"/>
+            </w:tcMar>
+            <w:vAlign w:val="center"/>
+          </w:tcPr>
+          <w:p>
+            <w:pPr>
+              <w:keepNext/>
+              <w:spacing w:after="0" w:line="252"/>
+              <w:jc w:val="center"/>
+            </w:pPr>
+          </w:p>
+        </w:tc>
+        <w:tc>
+          <w:tcPr>
+            <w:tcW w:type="dxa" w:w="1134"/>
+            <w:tcMar>
+              <w:top w:type="dxa" w:w="50"/>
+              <w:left w:type="dxa" w:w="100"/>
+              <w:bottom w:type="dxa" w:w="50"/>
+              <w:right w:type="dxa" w:w="100"/>
+            </w:tcMar>
+            <w:vAlign w:val="center"/>
+          </w:tcPr>
+          <w:p>
+            <w:pPr>
+              <w:keepNext/>
+              <w:spacing w:after="0" w:line="252"/>
+              <w:jc w:val="center"/>
+            </w:pPr>
+          </w:p>
+        </w:tc>
+        <w:tc>
+          <w:tcPr>
+            <w:tcW w:type="dxa" w:w="1134"/>
+            <w:tcMar>
+              <w:top w:type="dxa" w:w="50"/>
+              <w:left w:type="dxa" w:w="100"/>
+              <w:bottom w:type="dxa" w:w="50"/>
+              <w:right w:type="dxa" w:w="100"/>
+            </w:tcMar>
+            <w:vAlign w:val="center"/>
+          </w:tcPr>
+          <w:p>
+            <w:pPr>
+              <w:keepNext/>
+              <w:spacing w:after="0" w:line="252"/>
+              <w:jc w:val="center"/>
+            </w:pPr>
+          </w:p>
+        </w:tc>
+        <w:tc>
+          <w:tcPr>
+            <w:tcW w:type="dxa" w:w="6237"/>
             <w:tcMar>
               <w:top w:type="dxa" w:w="50"/>
               <w:left w:type="dxa" w:w="100"/>
@@ -7759,7 +7613,7 @@
         </w:trPr>
         <w:tc>
           <w:tcPr>
-            <w:tcW w:type="dxa" w:w="771"/>
+            <w:tcW w:type="dxa" w:w="1134"/>
             <w:tcMar>
               <w:top w:type="dxa" w:w="50"/>
               <w:left w:type="dxa" w:w="100"/>
@@ -7778,7 +7632,7 @@
         </w:tc>
         <w:tc>
           <w:tcPr>
-            <w:tcW w:type="dxa" w:w="771"/>
+            <w:tcW w:type="dxa" w:w="1134"/>
             <w:tcMar>
               <w:top w:type="dxa" w:w="50"/>
               <w:left w:type="dxa" w:w="100"/>
@@ -7797,7 +7651,7 @@
         </w:tc>
         <w:tc>
           <w:tcPr>
-            <w:tcW w:type="dxa" w:w="771"/>
+            <w:tcW w:type="dxa" w:w="1134"/>
             <w:tcMar>
               <w:top w:type="dxa" w:w="50"/>
               <w:left w:type="dxa" w:w="100"/>
@@ -7816,26 +7670,7 @@
         </w:tc>
         <w:tc>
           <w:tcPr>
-            <w:tcW w:type="dxa" w:w="3084"/>
-            <w:tcMar>
-              <w:top w:type="dxa" w:w="50"/>
-              <w:left w:type="dxa" w:w="100"/>
-              <w:bottom w:type="dxa" w:w="50"/>
-              <w:right w:type="dxa" w:w="100"/>
-            </w:tcMar>
-            <w:vAlign w:val="center"/>
-          </w:tcPr>
-          <w:p>
-            <w:pPr>
-              <w:keepNext w:val="false"/>
-              <w:spacing w:after="0" w:line="252"/>
-              <w:jc w:val="center"/>
-            </w:pPr>
-          </w:p>
-        </w:tc>
-        <w:tc>
-          <w:tcPr>
-            <w:tcW w:type="dxa" w:w="4241"/>
+            <w:tcW w:type="dxa" w:w="6237"/>
             <w:tcMar>
               <w:top w:type="dxa" w:w="50"/>
               <w:left w:type="dxa" w:w="100"/>
@@ -9401,12 +9236,10 @@
               <w:tblLayout w:type="fixed"/>
             </w:tblPr>
             <w:tblGrid>
-              <w:gridCol w:w="737"/>
-              <w:gridCol w:w="737"/>
-              <w:gridCol w:w="1198"/>
-              <w:gridCol w:w="922"/>
-              <w:gridCol w:w="2765"/>
-              <w:gridCol w:w="2859"/>
+              <w:gridCol w:w="933"/>
+              <w:gridCol w:w="1167"/>
+              <w:gridCol w:w="3500"/>
+              <w:gridCol w:w="3618"/>
             </w:tblGrid>
             <w:tr>
               <w:trPr>
@@ -9415,7 +9248,7 @@
               </w:trPr>
               <w:tc>
                 <w:tcPr>
-                  <w:tcW w:type="dxa" w:w="737"/>
+                  <w:tcW w:type="dxa" w:w="933"/>
                   <w:shd w:fill="1F4E79" w:color="auto" w:val="clear"/>
                   <w:tcMar>
                     <w:top w:type="dxa" w:w="50"/>
@@ -9446,69 +9279,7 @@
               </w:tc>
               <w:tc>
                 <w:tcPr>
-                  <w:tcW w:type="dxa" w:w="737"/>
-                  <w:shd w:fill="1F4E79" w:color="auto" w:val="clear"/>
-                  <w:tcMar>
-                    <w:top w:type="dxa" w:w="50"/>
-                    <w:left w:type="dxa" w:w="100"/>
-                    <w:bottom w:type="dxa" w:w="50"/>
-                    <w:right w:type="dxa" w:w="100"/>
-                  </w:tcMar>
-                  <w:vAlign w:val="center"/>
-                </w:tcPr>
-                <w:p>
-                  <w:pPr>
-                    <w:keepNext w:val="false"/>
-                    <w:spacing w:after="0" w:line="252"/>
-                    <w:jc w:val="center"/>
-                  </w:pPr>
-                  <w:r>
-                    <w:rPr>
-                      <w:rFonts w:ascii="Calibri" w:cs="Calibri" w:eastAsia="Calibri" w:hAnsi="Calibri"/>
-                      <w:b/>
-                      <w:bCs/>
-                      <w:color w:val="FFFFFF"/>
-                      <w:sz w:val="18"/>
-                      <w:szCs w:val="18"/>
-                    </w:rPr>
-                    <w:t xml:space="preserve">r[i]</w:t>
-                  </w:r>
-                </w:p>
-              </w:tc>
-              <w:tc>
-                <w:tcPr>
-                  <w:tcW w:type="dxa" w:w="1198"/>
-                  <w:shd w:fill="1F4E79" w:color="auto" w:val="clear"/>
-                  <w:tcMar>
-                    <w:top w:type="dxa" w:w="50"/>
-                    <w:left w:type="dxa" w:w="100"/>
-                    <w:bottom w:type="dxa" w:w="50"/>
-                    <w:right w:type="dxa" w:w="100"/>
-                  </w:tcMar>
-                  <w:vAlign w:val="center"/>
-                </w:tcPr>
-                <w:p>
-                  <w:pPr>
-                    <w:keepNext w:val="false"/>
-                    <w:spacing w:after="0" w:line="252"/>
-                    <w:jc w:val="center"/>
-                  </w:pPr>
-                  <w:r>
-                    <w:rPr>
-                      <w:rFonts w:ascii="Calibri" w:cs="Calibri" w:eastAsia="Calibri" w:hAnsi="Calibri"/>
-                      <w:b/>
-                      <w:bCs/>
-                      <w:color w:val="FFFFFF"/>
-                      <w:sz w:val="18"/>
-                      <w:szCs w:val="18"/>
-                    </w:rPr>
-                    <w:t xml:space="preserve">r[i] &lt; 4?</w:t>
-                  </w:r>
-                </w:p>
-              </w:tc>
-              <w:tc>
-                <w:tcPr>
-                  <w:tcW w:type="dxa" w:w="922"/>
+                  <w:tcW w:type="dxa" w:w="1167"/>
                   <w:shd w:fill="1F4E79" w:color="auto" w:val="clear"/>
                   <w:tcMar>
                     <w:top w:type="dxa" w:w="50"/>
@@ -9539,7 +9310,7 @@
               </w:tc>
               <w:tc>
                 <w:tcPr>
-                  <w:tcW w:type="dxa" w:w="2765"/>
+                  <w:tcW w:type="dxa" w:w="3500"/>
                   <w:shd w:fill="1F4E79" w:color="auto" w:val="clear"/>
                   <w:tcMar>
                     <w:top w:type="dxa" w:w="50"/>
@@ -9570,7 +9341,7 @@
               </w:tc>
               <w:tc>
                 <w:tcPr>
-                  <w:tcW w:type="dxa" w:w="2859"/>
+                  <w:tcW w:type="dxa" w:w="3618"/>
                   <w:shd w:fill="1F4E79" w:color="auto" w:val="clear"/>
                   <w:tcMar>
                     <w:top w:type="dxa" w:w="50"/>
@@ -9606,7 +9377,7 @@
               </w:trPr>
               <w:tc>
                 <w:tcPr>
-                  <w:tcW w:type="dxa" w:w="737"/>
+                  <w:tcW w:type="dxa" w:w="933"/>
                   <w:tcMar>
                     <w:top w:type="dxa" w:w="50"/>
                     <w:left w:type="dxa" w:w="100"/>
@@ -9634,63 +9405,7 @@
               </w:tc>
               <w:tc>
                 <w:tcPr>
-                  <w:tcW w:type="dxa" w:w="737"/>
-                  <w:tcMar>
-                    <w:top w:type="dxa" w:w="50"/>
-                    <w:left w:type="dxa" w:w="100"/>
-                    <w:bottom w:type="dxa" w:w="50"/>
-                    <w:right w:type="dxa" w:w="100"/>
-                  </w:tcMar>
-                  <w:vAlign w:val="center"/>
-                </w:tcPr>
-                <w:p>
-                  <w:pPr>
-                    <w:keepNext w:val="false"/>
-                    <w:spacing w:after="0" w:line="252"/>
-                    <w:jc w:val="center"/>
-                  </w:pPr>
-                  <w:r>
-                    <w:rPr>
-                      <w:rFonts w:ascii="Calibri" w:cs="Calibri" w:eastAsia="Calibri" w:hAnsi="Calibri"/>
-                      <w:color w:val="222222"/>
-                      <w:sz w:val="18"/>
-                      <w:szCs w:val="18"/>
-                    </w:rPr>
-                    <w:t xml:space="preserve">–</w:t>
-                  </w:r>
-                </w:p>
-              </w:tc>
-              <w:tc>
-                <w:tcPr>
-                  <w:tcW w:type="dxa" w:w="1198"/>
-                  <w:tcMar>
-                    <w:top w:type="dxa" w:w="50"/>
-                    <w:left w:type="dxa" w:w="100"/>
-                    <w:bottom w:type="dxa" w:w="50"/>
-                    <w:right w:type="dxa" w:w="100"/>
-                  </w:tcMar>
-                  <w:vAlign w:val="center"/>
-                </w:tcPr>
-                <w:p>
-                  <w:pPr>
-                    <w:keepNext w:val="false"/>
-                    <w:spacing w:after="0" w:line="252"/>
-                    <w:jc w:val="center"/>
-                  </w:pPr>
-                  <w:r>
-                    <w:rPr>
-                      <w:rFonts w:ascii="Calibri" w:cs="Calibri" w:eastAsia="Calibri" w:hAnsi="Calibri"/>
-                      <w:color w:val="222222"/>
-                      <w:sz w:val="18"/>
-                      <w:szCs w:val="18"/>
-                    </w:rPr>
-                    <w:t xml:space="preserve">–</w:t>
-                  </w:r>
-                </w:p>
-              </w:tc>
-              <w:tc>
-                <w:tcPr>
-                  <w:tcW w:type="dxa" w:w="922"/>
+                  <w:tcW w:type="dxa" w:w="1167"/>
                   <w:tcMar>
                     <w:top w:type="dxa" w:w="50"/>
                     <w:left w:type="dxa" w:w="100"/>
@@ -9718,7 +9433,7 @@
               </w:tc>
               <w:tc>
                 <w:tcPr>
-                  <w:tcW w:type="dxa" w:w="2765"/>
+                  <w:tcW w:type="dxa" w:w="3500"/>
                   <w:tcMar>
                     <w:top w:type="dxa" w:w="50"/>
                     <w:left w:type="dxa" w:w="100"/>
@@ -9746,7 +9461,7 @@
               </w:tc>
               <w:tc>
                 <w:tcPr>
-                  <w:tcW w:type="dxa" w:w="2859"/>
+                  <w:tcW w:type="dxa" w:w="3618"/>
                   <w:tcMar>
                     <w:top w:type="dxa" w:w="50"/>
                     <w:left w:type="dxa" w:w="100"/>
@@ -9770,7 +9485,7 @@
               </w:trPr>
               <w:tc>
                 <w:tcPr>
-                  <w:tcW w:type="dxa" w:w="737"/>
+                  <w:tcW w:type="dxa" w:w="933"/>
                   <w:tcMar>
                     <w:top w:type="dxa" w:w="50"/>
                     <w:left w:type="dxa" w:w="100"/>
@@ -9798,63 +9513,7 @@
               </w:tc>
               <w:tc>
                 <w:tcPr>
-                  <w:tcW w:type="dxa" w:w="737"/>
-                  <w:tcMar>
-                    <w:top w:type="dxa" w:w="50"/>
-                    <w:left w:type="dxa" w:w="100"/>
-                    <w:bottom w:type="dxa" w:w="50"/>
-                    <w:right w:type="dxa" w:w="100"/>
-                  </w:tcMar>
-                  <w:vAlign w:val="center"/>
-                </w:tcPr>
-                <w:p>
-                  <w:pPr>
-                    <w:keepNext w:val="false"/>
-                    <w:spacing w:after="0" w:line="252"/>
-                    <w:jc w:val="center"/>
-                  </w:pPr>
-                  <w:r>
-                    <w:rPr>
-                      <w:rFonts w:ascii="Calibri" w:cs="Calibri" w:eastAsia="Calibri" w:hAnsi="Calibri"/>
-                      <w:color w:val="222222"/>
-                      <w:sz w:val="18"/>
-                      <w:szCs w:val="18"/>
-                    </w:rPr>
-                    <w:t xml:space="preserve">7</w:t>
-                  </w:r>
-                </w:p>
-              </w:tc>
-              <w:tc>
-                <w:tcPr>
-                  <w:tcW w:type="dxa" w:w="1198"/>
-                  <w:tcMar>
-                    <w:top w:type="dxa" w:w="50"/>
-                    <w:left w:type="dxa" w:w="100"/>
-                    <w:bottom w:type="dxa" w:w="50"/>
-                    <w:right w:type="dxa" w:w="100"/>
-                  </w:tcMar>
-                  <w:vAlign w:val="center"/>
-                </w:tcPr>
-                <w:p>
-                  <w:pPr>
-                    <w:keepNext w:val="false"/>
-                    <w:spacing w:after="0" w:line="252"/>
-                    <w:jc w:val="center"/>
-                  </w:pPr>
-                  <w:r>
-                    <w:rPr>
-                      <w:rFonts w:ascii="Calibri" w:cs="Calibri" w:eastAsia="Calibri" w:hAnsi="Calibri"/>
-                      <w:color w:val="222222"/>
-                      <w:sz w:val="18"/>
-                      <w:szCs w:val="18"/>
-                    </w:rPr>
-                    <w:t xml:space="preserve">nein</w:t>
-                  </w:r>
-                </w:p>
-              </w:tc>
-              <w:tc>
-                <w:tcPr>
-                  <w:tcW w:type="dxa" w:w="922"/>
+                  <w:tcW w:type="dxa" w:w="1167"/>
                   <w:tcMar>
                     <w:top w:type="dxa" w:w="50"/>
                     <w:left w:type="dxa" w:w="100"/>
@@ -9882,7 +9541,7 @@
               </w:tc>
               <w:tc>
                 <w:tcPr>
-                  <w:tcW w:type="dxa" w:w="2765"/>
+                  <w:tcW w:type="dxa" w:w="3500"/>
                   <w:tcMar>
                     <w:top w:type="dxa" w:w="50"/>
                     <w:left w:type="dxa" w:w="100"/>
@@ -9910,7 +9569,7 @@
               </w:tc>
               <w:tc>
                 <w:tcPr>
-                  <w:tcW w:type="dxa" w:w="2859"/>
+                  <w:tcW w:type="dxa" w:w="3618"/>
                   <w:tcMar>
                     <w:top w:type="dxa" w:w="50"/>
                     <w:left w:type="dxa" w:w="100"/>
@@ -9934,7 +9593,7 @@
               </w:trPr>
               <w:tc>
                 <w:tcPr>
-                  <w:tcW w:type="dxa" w:w="737"/>
+                  <w:tcW w:type="dxa" w:w="933"/>
                   <w:tcMar>
                     <w:top w:type="dxa" w:w="50"/>
                     <w:left w:type="dxa" w:w="100"/>
@@ -9962,7 +9621,7 @@
               </w:tc>
               <w:tc>
                 <w:tcPr>
-                  <w:tcW w:type="dxa" w:w="737"/>
+                  <w:tcW w:type="dxa" w:w="1167"/>
                   <w:tcMar>
                     <w:top w:type="dxa" w:w="50"/>
                     <w:left w:type="dxa" w:w="100"/>
@@ -9990,63 +9649,7 @@
               </w:tc>
               <w:tc>
                 <w:tcPr>
-                  <w:tcW w:type="dxa" w:w="1198"/>
-                  <w:tcMar>
-                    <w:top w:type="dxa" w:w="50"/>
-                    <w:left w:type="dxa" w:w="100"/>
-                    <w:bottom w:type="dxa" w:w="50"/>
-                    <w:right w:type="dxa" w:w="100"/>
-                  </w:tcMar>
-                  <w:vAlign w:val="center"/>
-                </w:tcPr>
-                <w:p>
-                  <w:pPr>
-                    <w:keepNext w:val="false"/>
-                    <w:spacing w:after="0" w:line="252"/>
-                    <w:jc w:val="center"/>
-                  </w:pPr>
-                  <w:r>
-                    <w:rPr>
-                      <w:rFonts w:ascii="Calibri" w:cs="Calibri" w:eastAsia="Calibri" w:hAnsi="Calibri"/>
-                      <w:color w:val="222222"/>
-                      <w:sz w:val="18"/>
-                      <w:szCs w:val="18"/>
-                    </w:rPr>
-                    <w:t xml:space="preserve">ja</w:t>
-                  </w:r>
-                </w:p>
-              </w:tc>
-              <w:tc>
-                <w:tcPr>
-                  <w:tcW w:type="dxa" w:w="922"/>
-                  <w:tcMar>
-                    <w:top w:type="dxa" w:w="50"/>
-                    <w:left w:type="dxa" w:w="100"/>
-                    <w:bottom w:type="dxa" w:w="50"/>
-                    <w:right w:type="dxa" w:w="100"/>
-                  </w:tcMar>
-                  <w:vAlign w:val="center"/>
-                </w:tcPr>
-                <w:p>
-                  <w:pPr>
-                    <w:keepNext w:val="false"/>
-                    <w:spacing w:after="0" w:line="252"/>
-                    <w:jc w:val="center"/>
-                  </w:pPr>
-                  <w:r>
-                    <w:rPr>
-                      <w:rFonts w:ascii="Calibri" w:cs="Calibri" w:eastAsia="Calibri" w:hAnsi="Calibri"/>
-                      <w:color w:val="222222"/>
-                      <w:sz w:val="18"/>
-                      <w:szCs w:val="18"/>
-                    </w:rPr>
-                    <w:t xml:space="preserve">1</w:t>
-                  </w:r>
-                </w:p>
-              </w:tc>
-              <w:tc>
-                <w:tcPr>
-                  <w:tcW w:type="dxa" w:w="2765"/>
+                  <w:tcW w:type="dxa" w:w="3500"/>
                   <w:tcMar>
                     <w:top w:type="dxa" w:w="50"/>
                     <w:left w:type="dxa" w:w="100"/>
@@ -10074,7 +9677,7 @@
               </w:tc>
               <w:tc>
                 <w:tcPr>
-                  <w:tcW w:type="dxa" w:w="2859"/>
+                  <w:tcW w:type="dxa" w:w="3618"/>
                   <w:tcMar>
                     <w:top w:type="dxa" w:w="50"/>
                     <w:left w:type="dxa" w:w="100"/>
@@ -10107,7 +9710,7 @@
               </w:trPr>
               <w:tc>
                 <w:tcPr>
-                  <w:tcW w:type="dxa" w:w="737"/>
+                  <w:tcW w:type="dxa" w:w="933"/>
                   <w:tcMar>
                     <w:top w:type="dxa" w:w="50"/>
                     <w:left w:type="dxa" w:w="100"/>
@@ -10135,63 +9738,7 @@
               </w:tc>
               <w:tc>
                 <w:tcPr>
-                  <w:tcW w:type="dxa" w:w="737"/>
-                  <w:tcMar>
-                    <w:top w:type="dxa" w:w="50"/>
-                    <w:left w:type="dxa" w:w="100"/>
-                    <w:bottom w:type="dxa" w:w="50"/>
-                    <w:right w:type="dxa" w:w="100"/>
-                  </w:tcMar>
-                  <w:vAlign w:val="center"/>
-                </w:tcPr>
-                <w:p>
-                  <w:pPr>
-                    <w:keepNext w:val="false"/>
-                    <w:spacing w:after="0" w:line="252"/>
-                    <w:jc w:val="center"/>
-                  </w:pPr>
-                  <w:r>
-                    <w:rPr>
-                      <w:rFonts w:ascii="Calibri" w:cs="Calibri" w:eastAsia="Calibri" w:hAnsi="Calibri"/>
-                      <w:color w:val="222222"/>
-                      <w:sz w:val="18"/>
-                      <w:szCs w:val="18"/>
-                    </w:rPr>
-                    <w:t xml:space="preserve">5</w:t>
-                  </w:r>
-                </w:p>
-              </w:tc>
-              <w:tc>
-                <w:tcPr>
-                  <w:tcW w:type="dxa" w:w="1198"/>
-                  <w:tcMar>
-                    <w:top w:type="dxa" w:w="50"/>
-                    <w:left w:type="dxa" w:w="100"/>
-                    <w:bottom w:type="dxa" w:w="50"/>
-                    <w:right w:type="dxa" w:w="100"/>
-                  </w:tcMar>
-                  <w:vAlign w:val="center"/>
-                </w:tcPr>
-                <w:p>
-                  <w:pPr>
-                    <w:keepNext w:val="false"/>
-                    <w:spacing w:after="0" w:line="252"/>
-                    <w:jc w:val="center"/>
-                  </w:pPr>
-                  <w:r>
-                    <w:rPr>
-                      <w:rFonts w:ascii="Calibri" w:cs="Calibri" w:eastAsia="Calibri" w:hAnsi="Calibri"/>
-                      <w:color w:val="222222"/>
-                      <w:sz w:val="18"/>
-                      <w:szCs w:val="18"/>
-                    </w:rPr>
-                    <w:t xml:space="preserve">nein</w:t>
-                  </w:r>
-                </w:p>
-              </w:tc>
-              <w:tc>
-                <w:tcPr>
-                  <w:tcW w:type="dxa" w:w="922"/>
+                  <w:tcW w:type="dxa" w:w="1167"/>
                   <w:tcMar>
                     <w:top w:type="dxa" w:w="50"/>
                     <w:left w:type="dxa" w:w="100"/>
@@ -10219,7 +9766,7 @@
               </w:tc>
               <w:tc>
                 <w:tcPr>
-                  <w:tcW w:type="dxa" w:w="2765"/>
+                  <w:tcW w:type="dxa" w:w="3500"/>
                   <w:tcMar>
                     <w:top w:type="dxa" w:w="50"/>
                     <w:left w:type="dxa" w:w="100"/>
@@ -10247,7 +9794,7 @@
               </w:tc>
               <w:tc>
                 <w:tcPr>
-                  <w:tcW w:type="dxa" w:w="2859"/>
+                  <w:tcW w:type="dxa" w:w="3618"/>
                   <w:tcMar>
                     <w:top w:type="dxa" w:w="50"/>
                     <w:left w:type="dxa" w:w="100"/>
@@ -10271,7 +9818,7 @@
               </w:trPr>
               <w:tc>
                 <w:tcPr>
-                  <w:tcW w:type="dxa" w:w="737"/>
+                  <w:tcW w:type="dxa" w:w="933"/>
                   <w:tcMar>
                     <w:top w:type="dxa" w:w="50"/>
                     <w:left w:type="dxa" w:w="100"/>
@@ -10299,7 +9846,7 @@
               </w:tc>
               <w:tc>
                 <w:tcPr>
-                  <w:tcW w:type="dxa" w:w="737"/>
+                  <w:tcW w:type="dxa" w:w="1167"/>
                   <w:tcMar>
                     <w:top w:type="dxa" w:w="50"/>
                     <w:left w:type="dxa" w:w="100"/>
@@ -10327,63 +9874,7 @@
               </w:tc>
               <w:tc>
                 <w:tcPr>
-                  <w:tcW w:type="dxa" w:w="1198"/>
-                  <w:tcMar>
-                    <w:top w:type="dxa" w:w="50"/>
-                    <w:left w:type="dxa" w:w="100"/>
-                    <w:bottom w:type="dxa" w:w="50"/>
-                    <w:right w:type="dxa" w:w="100"/>
-                  </w:tcMar>
-                  <w:vAlign w:val="center"/>
-                </w:tcPr>
-                <w:p>
-                  <w:pPr>
-                    <w:keepNext w:val="false"/>
-                    <w:spacing w:after="0" w:line="252"/>
-                    <w:jc w:val="center"/>
-                  </w:pPr>
-                  <w:r>
-                    <w:rPr>
-                      <w:rFonts w:ascii="Calibri" w:cs="Calibri" w:eastAsia="Calibri" w:hAnsi="Calibri"/>
-                      <w:color w:val="222222"/>
-                      <w:sz w:val="18"/>
-                      <w:szCs w:val="18"/>
-                    </w:rPr>
-                    <w:t xml:space="preserve">ja</w:t>
-                  </w:r>
-                </w:p>
-              </w:tc>
-              <w:tc>
-                <w:tcPr>
-                  <w:tcW w:type="dxa" w:w="922"/>
-                  <w:tcMar>
-                    <w:top w:type="dxa" w:w="50"/>
-                    <w:left w:type="dxa" w:w="100"/>
-                    <w:bottom w:type="dxa" w:w="50"/>
-                    <w:right w:type="dxa" w:w="100"/>
-                  </w:tcMar>
-                  <w:vAlign w:val="center"/>
-                </w:tcPr>
-                <w:p>
-                  <w:pPr>
-                    <w:keepNext w:val="false"/>
-                    <w:spacing w:after="0" w:line="252"/>
-                    <w:jc w:val="center"/>
-                  </w:pPr>
-                  <w:r>
-                    <w:rPr>
-                      <w:rFonts w:ascii="Calibri" w:cs="Calibri" w:eastAsia="Calibri" w:hAnsi="Calibri"/>
-                      <w:color w:val="222222"/>
-                      <w:sz w:val="18"/>
-                      <w:szCs w:val="18"/>
-                    </w:rPr>
-                    <w:t xml:space="preserve">2</w:t>
-                  </w:r>
-                </w:p>
-              </w:tc>
-              <w:tc>
-                <w:tcPr>
-                  <w:tcW w:type="dxa" w:w="2765"/>
+                  <w:tcW w:type="dxa" w:w="3500"/>
                   <w:tcMar>
                     <w:top w:type="dxa" w:w="50"/>
                     <w:left w:type="dxa" w:w="100"/>
@@ -10411,7 +9902,7 @@
               </w:tc>
               <w:tc>
                 <w:tcPr>
-                  <w:tcW w:type="dxa" w:w="2859"/>
+                  <w:tcW w:type="dxa" w:w="3618"/>
                   <w:tcMar>
                     <w:top w:type="dxa" w:w="50"/>
                     <w:left w:type="dxa" w:w="100"/>
@@ -10444,7 +9935,7 @@
               </w:trPr>
               <w:tc>
                 <w:tcPr>
-                  <w:tcW w:type="dxa" w:w="737"/>
+                  <w:tcW w:type="dxa" w:w="933"/>
                   <w:tcMar>
                     <w:top w:type="dxa" w:w="50"/>
                     <w:left w:type="dxa" w:w="100"/>
@@ -10472,63 +9963,7 @@
               </w:tc>
               <w:tc>
                 <w:tcPr>
-                  <w:tcW w:type="dxa" w:w="737"/>
-                  <w:tcMar>
-                    <w:top w:type="dxa" w:w="50"/>
-                    <w:left w:type="dxa" w:w="100"/>
-                    <w:bottom w:type="dxa" w:w="50"/>
-                    <w:right w:type="dxa" w:w="100"/>
-                  </w:tcMar>
-                  <w:vAlign w:val="center"/>
-                </w:tcPr>
-                <w:p>
-                  <w:pPr>
-                    <w:keepNext w:val="false"/>
-                    <w:spacing w:after="0" w:line="252"/>
-                    <w:jc w:val="center"/>
-                  </w:pPr>
-                  <w:r>
-                    <w:rPr>
-                      <w:rFonts w:ascii="Calibri" w:cs="Calibri" w:eastAsia="Calibri" w:hAnsi="Calibri"/>
-                      <w:color w:val="222222"/>
-                      <w:sz w:val="18"/>
-                      <w:szCs w:val="18"/>
-                    </w:rPr>
-                    <w:t xml:space="preserve">–</w:t>
-                  </w:r>
-                </w:p>
-              </w:tc>
-              <w:tc>
-                <w:tcPr>
-                  <w:tcW w:type="dxa" w:w="1198"/>
-                  <w:tcMar>
-                    <w:top w:type="dxa" w:w="50"/>
-                    <w:left w:type="dxa" w:w="100"/>
-                    <w:bottom w:type="dxa" w:w="50"/>
-                    <w:right w:type="dxa" w:w="100"/>
-                  </w:tcMar>
-                  <w:vAlign w:val="center"/>
-                </w:tcPr>
-                <w:p>
-                  <w:pPr>
-                    <w:keepNext w:val="false"/>
-                    <w:spacing w:after="0" w:line="252"/>
-                    <w:jc w:val="center"/>
-                  </w:pPr>
-                  <w:r>
-                    <w:rPr>
-                      <w:rFonts w:ascii="Calibri" w:cs="Calibri" w:eastAsia="Calibri" w:hAnsi="Calibri"/>
-                      <w:color w:val="222222"/>
-                      <w:sz w:val="18"/>
-                      <w:szCs w:val="18"/>
-                    </w:rPr>
-                    <w:t xml:space="preserve">–</w:t>
-                  </w:r>
-                </w:p>
-              </w:tc>
-              <w:tc>
-                <w:tcPr>
-                  <w:tcW w:type="dxa" w:w="922"/>
+                  <w:tcW w:type="dxa" w:w="1167"/>
                   <w:tcMar>
                     <w:top w:type="dxa" w:w="50"/>
                     <w:left w:type="dxa" w:w="100"/>
@@ -10556,7 +9991,7 @@
               </w:tc>
               <w:tc>
                 <w:tcPr>
-                  <w:tcW w:type="dxa" w:w="2765"/>
+                  <w:tcW w:type="dxa" w:w="3500"/>
                   <w:tcMar>
                     <w:top w:type="dxa" w:w="50"/>
                     <w:left w:type="dxa" w:w="100"/>
@@ -10584,7 +10019,7 @@
               </w:tc>
               <w:tc>
                 <w:tcPr>
-                  <w:tcW w:type="dxa" w:w="2859"/>
+                  <w:tcW w:type="dxa" w:w="3618"/>
                   <w:tcMar>
                     <w:top w:type="dxa" w:w="50"/>
                     <w:left w:type="dxa" w:w="100"/>
@@ -10788,7 +10223,7 @@
                 <w:sz w:val="22"/>
                 <w:szCs w:val="22"/>
               </w:rPr>
-              <w:t xml:space="preserve"> Schritt für Schritt aus (Format wie im Beispiel). Gib die Rückgabe und die Anzahl der Vergleiche an.</w:t>
+              <w:t xml:space="preserve"> Schritt für Schritt aus (Format wie im Beispiel): eine Zeile vor der Schleife (–), eine am Ende jedes Schleifendurchlaufs und eine nach dem Schlusstausch (Ende). Gib die Rückgabe und die Anzahl der Vergleiche an.</w:t>
             </w:r>
           </w:p>
         </w:tc>
@@ -10842,11 +10277,9 @@
         <w:tblLayout w:type="fixed"/>
       </w:tblPr>
       <w:tblGrid>
-        <w:gridCol w:w="771"/>
-        <w:gridCol w:w="867"/>
-        <w:gridCol w:w="1253"/>
-        <w:gridCol w:w="1060"/>
-        <w:gridCol w:w="5687"/>
+        <w:gridCol w:w="988"/>
+        <w:gridCol w:w="1359"/>
+        <w:gridCol w:w="7291"/>
       </w:tblGrid>
       <w:tr>
         <w:trPr>
@@ -10855,7 +10288,7 @@
         </w:trPr>
         <w:tc>
           <w:tcPr>
-            <w:tcW w:type="dxa" w:w="771"/>
+            <w:tcW w:type="dxa" w:w="988"/>
             <w:shd w:fill="1F4E79" w:color="auto" w:val="clear"/>
             <w:tcMar>
               <w:top w:type="dxa" w:w="50"/>
@@ -10886,7 +10319,7 @@
         </w:tc>
         <w:tc>
           <w:tcPr>
-            <w:tcW w:type="dxa" w:w="867"/>
+            <w:tcW w:type="dxa" w:w="1359"/>
             <w:shd w:fill="1F4E79" w:color="auto" w:val="clear"/>
             <w:tcMar>
               <w:top w:type="dxa" w:w="50"/>
@@ -10911,75 +10344,13 @@
                 <w:sz w:val="19"/>
                 <w:szCs w:val="19"/>
               </w:rPr>
-              <w:t xml:space="preserve">r[i]</w:t>
-            </w:r>
-          </w:p>
-        </w:tc>
-        <w:tc>
-          <w:tcPr>
-            <w:tcW w:type="dxa" w:w="1253"/>
-            <w:shd w:fill="1F4E79" w:color="auto" w:val="clear"/>
-            <w:tcMar>
-              <w:top w:type="dxa" w:w="50"/>
-              <w:left w:type="dxa" w:w="100"/>
-              <w:bottom w:type="dxa" w:w="50"/>
-              <w:right w:type="dxa" w:w="100"/>
-            </w:tcMar>
-            <w:vAlign w:val="center"/>
-          </w:tcPr>
-          <w:p>
-            <w:pPr>
-              <w:keepNext/>
-              <w:spacing w:after="0" w:line="252"/>
-              <w:jc w:val="center"/>
-            </w:pPr>
-            <w:r>
-              <w:rPr>
-                <w:rFonts w:ascii="Calibri" w:cs="Calibri" w:eastAsia="Calibri" w:hAnsi="Calibri"/>
-                <w:b/>
-                <w:bCs/>
-                <w:color w:val="FFFFFF"/>
-                <w:sz w:val="19"/>
-                <w:szCs w:val="19"/>
-              </w:rPr>
-              <w:t xml:space="preserve">r[i] &lt; 6?</w:t>
-            </w:r>
-          </w:p>
-        </w:tc>
-        <w:tc>
-          <w:tcPr>
-            <w:tcW w:type="dxa" w:w="1060"/>
-            <w:shd w:fill="1F4E79" w:color="auto" w:val="clear"/>
-            <w:tcMar>
-              <w:top w:type="dxa" w:w="50"/>
-              <w:left w:type="dxa" w:w="100"/>
-              <w:bottom w:type="dxa" w:w="50"/>
-              <w:right w:type="dxa" w:w="100"/>
-            </w:tcMar>
-            <w:vAlign w:val="center"/>
-          </w:tcPr>
-          <w:p>
-            <w:pPr>
-              <w:keepNext/>
-              <w:spacing w:after="0" w:line="252"/>
-              <w:jc w:val="center"/>
-            </w:pPr>
-            <w:r>
-              <w:rPr>
-                <w:rFonts w:ascii="Calibri" w:cs="Calibri" w:eastAsia="Calibri" w:hAnsi="Calibri"/>
-                <w:b/>
-                <w:bCs/>
-                <w:color w:val="FFFFFF"/>
-                <w:sz w:val="19"/>
-                <w:szCs w:val="19"/>
-              </w:rPr>
               <w:t xml:space="preserve">grenze</w:t>
             </w:r>
           </w:p>
         </w:tc>
         <w:tc>
           <w:tcPr>
-            <w:tcW w:type="dxa" w:w="5687"/>
+            <w:tcW w:type="dxa" w:w="7291"/>
             <w:shd w:fill="1F4E79" w:color="auto" w:val="clear"/>
             <w:tcMar>
               <w:top w:type="dxa" w:w="50"/>
@@ -11016,7 +10387,7 @@
         </w:trPr>
         <w:tc>
           <w:tcPr>
-            <w:tcW w:type="dxa" w:w="771"/>
+            <w:tcW w:type="dxa" w:w="988"/>
             <w:tcMar>
               <w:top w:type="dxa" w:w="50"/>
               <w:left w:type="dxa" w:w="100"/>
@@ -11044,64 +10415,26 @@
         </w:tc>
         <w:tc>
           <w:tcPr>
-            <w:tcW w:type="dxa" w:w="867"/>
-            <w:tcMar>
-              <w:top w:type="dxa" w:w="50"/>
-              <w:left w:type="dxa" w:w="100"/>
-              <w:bottom w:type="dxa" w:w="50"/>
-              <w:right w:type="dxa" w:w="100"/>
-            </w:tcMar>
-            <w:vAlign w:val="center"/>
-          </w:tcPr>
-          <w:p>
-            <w:pPr>
-              <w:keepNext/>
-              <w:spacing w:after="0" w:line="252"/>
-              <w:jc w:val="center"/>
-            </w:pPr>
-          </w:p>
-        </w:tc>
-        <w:tc>
-          <w:tcPr>
-            <w:tcW w:type="dxa" w:w="1253"/>
-            <w:tcMar>
-              <w:top w:type="dxa" w:w="50"/>
-              <w:left w:type="dxa" w:w="100"/>
-              <w:bottom w:type="dxa" w:w="50"/>
-              <w:right w:type="dxa" w:w="100"/>
-            </w:tcMar>
-            <w:vAlign w:val="center"/>
-          </w:tcPr>
-          <w:p>
-            <w:pPr>
-              <w:keepNext/>
-              <w:spacing w:after="0" w:line="252"/>
-              <w:jc w:val="center"/>
-            </w:pPr>
-          </w:p>
-        </w:tc>
-        <w:tc>
-          <w:tcPr>
-            <w:tcW w:type="dxa" w:w="1060"/>
-            <w:tcMar>
-              <w:top w:type="dxa" w:w="50"/>
-              <w:left w:type="dxa" w:w="100"/>
-              <w:bottom w:type="dxa" w:w="50"/>
-              <w:right w:type="dxa" w:w="100"/>
-            </w:tcMar>
-            <w:vAlign w:val="center"/>
-          </w:tcPr>
-          <w:p>
-            <w:pPr>
-              <w:keepNext/>
-              <w:spacing w:after="0" w:line="252"/>
-              <w:jc w:val="center"/>
-            </w:pPr>
-          </w:p>
-        </w:tc>
-        <w:tc>
-          <w:tcPr>
-            <w:tcW w:type="dxa" w:w="5687"/>
+            <w:tcW w:type="dxa" w:w="1359"/>
+            <w:tcMar>
+              <w:top w:type="dxa" w:w="50"/>
+              <w:left w:type="dxa" w:w="100"/>
+              <w:bottom w:type="dxa" w:w="50"/>
+              <w:right w:type="dxa" w:w="100"/>
+            </w:tcMar>
+            <w:vAlign w:val="center"/>
+          </w:tcPr>
+          <w:p>
+            <w:pPr>
+              <w:keepNext/>
+              <w:spacing w:after="0" w:line="252"/>
+              <w:jc w:val="center"/>
+            </w:pPr>
+          </w:p>
+        </w:tc>
+        <w:tc>
+          <w:tcPr>
+            <w:tcW w:type="dxa" w:w="7291"/>
             <w:tcMar>
               <w:top w:type="dxa" w:w="50"/>
               <w:left w:type="dxa" w:w="100"/>
@@ -11126,7 +10459,7 @@
         </w:trPr>
         <w:tc>
           <w:tcPr>
-            <w:tcW w:type="dxa" w:w="771"/>
+            <w:tcW w:type="dxa" w:w="988"/>
             <w:tcMar>
               <w:top w:type="dxa" w:w="50"/>
               <w:left w:type="dxa" w:w="100"/>
@@ -11154,64 +10487,26 @@
         </w:tc>
         <w:tc>
           <w:tcPr>
-            <w:tcW w:type="dxa" w:w="867"/>
-            <w:tcMar>
-              <w:top w:type="dxa" w:w="50"/>
-              <w:left w:type="dxa" w:w="100"/>
-              <w:bottom w:type="dxa" w:w="50"/>
-              <w:right w:type="dxa" w:w="100"/>
-            </w:tcMar>
-            <w:vAlign w:val="center"/>
-          </w:tcPr>
-          <w:p>
-            <w:pPr>
-              <w:keepNext/>
-              <w:spacing w:after="0" w:line="252"/>
-              <w:jc w:val="center"/>
-            </w:pPr>
-          </w:p>
-        </w:tc>
-        <w:tc>
-          <w:tcPr>
-            <w:tcW w:type="dxa" w:w="1253"/>
-            <w:tcMar>
-              <w:top w:type="dxa" w:w="50"/>
-              <w:left w:type="dxa" w:w="100"/>
-              <w:bottom w:type="dxa" w:w="50"/>
-              <w:right w:type="dxa" w:w="100"/>
-            </w:tcMar>
-            <w:vAlign w:val="center"/>
-          </w:tcPr>
-          <w:p>
-            <w:pPr>
-              <w:keepNext/>
-              <w:spacing w:after="0" w:line="252"/>
-              <w:jc w:val="center"/>
-            </w:pPr>
-          </w:p>
-        </w:tc>
-        <w:tc>
-          <w:tcPr>
-            <w:tcW w:type="dxa" w:w="1060"/>
-            <w:tcMar>
-              <w:top w:type="dxa" w:w="50"/>
-              <w:left w:type="dxa" w:w="100"/>
-              <w:bottom w:type="dxa" w:w="50"/>
-              <w:right w:type="dxa" w:w="100"/>
-            </w:tcMar>
-            <w:vAlign w:val="center"/>
-          </w:tcPr>
-          <w:p>
-            <w:pPr>
-              <w:keepNext/>
-              <w:spacing w:after="0" w:line="252"/>
-              <w:jc w:val="center"/>
-            </w:pPr>
-          </w:p>
-        </w:tc>
-        <w:tc>
-          <w:tcPr>
-            <w:tcW w:type="dxa" w:w="5687"/>
+            <w:tcW w:type="dxa" w:w="1359"/>
+            <w:tcMar>
+              <w:top w:type="dxa" w:w="50"/>
+              <w:left w:type="dxa" w:w="100"/>
+              <w:bottom w:type="dxa" w:w="50"/>
+              <w:right w:type="dxa" w:w="100"/>
+            </w:tcMar>
+            <w:vAlign w:val="center"/>
+          </w:tcPr>
+          <w:p>
+            <w:pPr>
+              <w:keepNext/>
+              <w:spacing w:after="0" w:line="252"/>
+              <w:jc w:val="center"/>
+            </w:pPr>
+          </w:p>
+        </w:tc>
+        <w:tc>
+          <w:tcPr>
+            <w:tcW w:type="dxa" w:w="7291"/>
             <w:tcMar>
               <w:top w:type="dxa" w:w="50"/>
               <w:left w:type="dxa" w:w="100"/>
@@ -11236,7 +10531,7 @@
         </w:trPr>
         <w:tc>
           <w:tcPr>
-            <w:tcW w:type="dxa" w:w="771"/>
+            <w:tcW w:type="dxa" w:w="988"/>
             <w:tcMar>
               <w:top w:type="dxa" w:w="50"/>
               <w:left w:type="dxa" w:w="100"/>
@@ -11264,64 +10559,26 @@
         </w:tc>
         <w:tc>
           <w:tcPr>
-            <w:tcW w:type="dxa" w:w="867"/>
-            <w:tcMar>
-              <w:top w:type="dxa" w:w="50"/>
-              <w:left w:type="dxa" w:w="100"/>
-              <w:bottom w:type="dxa" w:w="50"/>
-              <w:right w:type="dxa" w:w="100"/>
-            </w:tcMar>
-            <w:vAlign w:val="center"/>
-          </w:tcPr>
-          <w:p>
-            <w:pPr>
-              <w:keepNext/>
-              <w:spacing w:after="0" w:line="252"/>
-              <w:jc w:val="center"/>
-            </w:pPr>
-          </w:p>
-        </w:tc>
-        <w:tc>
-          <w:tcPr>
-            <w:tcW w:type="dxa" w:w="1253"/>
-            <w:tcMar>
-              <w:top w:type="dxa" w:w="50"/>
-              <w:left w:type="dxa" w:w="100"/>
-              <w:bottom w:type="dxa" w:w="50"/>
-              <w:right w:type="dxa" w:w="100"/>
-            </w:tcMar>
-            <w:vAlign w:val="center"/>
-          </w:tcPr>
-          <w:p>
-            <w:pPr>
-              <w:keepNext/>
-              <w:spacing w:after="0" w:line="252"/>
-              <w:jc w:val="center"/>
-            </w:pPr>
-          </w:p>
-        </w:tc>
-        <w:tc>
-          <w:tcPr>
-            <w:tcW w:type="dxa" w:w="1060"/>
-            <w:tcMar>
-              <w:top w:type="dxa" w:w="50"/>
-              <w:left w:type="dxa" w:w="100"/>
-              <w:bottom w:type="dxa" w:w="50"/>
-              <w:right w:type="dxa" w:w="100"/>
-            </w:tcMar>
-            <w:vAlign w:val="center"/>
-          </w:tcPr>
-          <w:p>
-            <w:pPr>
-              <w:keepNext/>
-              <w:spacing w:after="0" w:line="252"/>
-              <w:jc w:val="center"/>
-            </w:pPr>
-          </w:p>
-        </w:tc>
-        <w:tc>
-          <w:tcPr>
-            <w:tcW w:type="dxa" w:w="5687"/>
+            <w:tcW w:type="dxa" w:w="1359"/>
+            <w:tcMar>
+              <w:top w:type="dxa" w:w="50"/>
+              <w:left w:type="dxa" w:w="100"/>
+              <w:bottom w:type="dxa" w:w="50"/>
+              <w:right w:type="dxa" w:w="100"/>
+            </w:tcMar>
+            <w:vAlign w:val="center"/>
+          </w:tcPr>
+          <w:p>
+            <w:pPr>
+              <w:keepNext/>
+              <w:spacing w:after="0" w:line="252"/>
+              <w:jc w:val="center"/>
+            </w:pPr>
+          </w:p>
+        </w:tc>
+        <w:tc>
+          <w:tcPr>
+            <w:tcW w:type="dxa" w:w="7291"/>
             <w:tcMar>
               <w:top w:type="dxa" w:w="50"/>
               <w:left w:type="dxa" w:w="100"/>
@@ -11346,7 +10603,7 @@
         </w:trPr>
         <w:tc>
           <w:tcPr>
-            <w:tcW w:type="dxa" w:w="771"/>
+            <w:tcW w:type="dxa" w:w="988"/>
             <w:tcMar>
               <w:top w:type="dxa" w:w="50"/>
               <w:left w:type="dxa" w:w="100"/>
@@ -11374,64 +10631,26 @@
         </w:tc>
         <w:tc>
           <w:tcPr>
-            <w:tcW w:type="dxa" w:w="867"/>
-            <w:tcMar>
-              <w:top w:type="dxa" w:w="50"/>
-              <w:left w:type="dxa" w:w="100"/>
-              <w:bottom w:type="dxa" w:w="50"/>
-              <w:right w:type="dxa" w:w="100"/>
-            </w:tcMar>
-            <w:vAlign w:val="center"/>
-          </w:tcPr>
-          <w:p>
-            <w:pPr>
-              <w:keepNext/>
-              <w:spacing w:after="0" w:line="252"/>
-              <w:jc w:val="center"/>
-            </w:pPr>
-          </w:p>
-        </w:tc>
-        <w:tc>
-          <w:tcPr>
-            <w:tcW w:type="dxa" w:w="1253"/>
-            <w:tcMar>
-              <w:top w:type="dxa" w:w="50"/>
-              <w:left w:type="dxa" w:w="100"/>
-              <w:bottom w:type="dxa" w:w="50"/>
-              <w:right w:type="dxa" w:w="100"/>
-            </w:tcMar>
-            <w:vAlign w:val="center"/>
-          </w:tcPr>
-          <w:p>
-            <w:pPr>
-              <w:keepNext/>
-              <w:spacing w:after="0" w:line="252"/>
-              <w:jc w:val="center"/>
-            </w:pPr>
-          </w:p>
-        </w:tc>
-        <w:tc>
-          <w:tcPr>
-            <w:tcW w:type="dxa" w:w="1060"/>
-            <w:tcMar>
-              <w:top w:type="dxa" w:w="50"/>
-              <w:left w:type="dxa" w:w="100"/>
-              <w:bottom w:type="dxa" w:w="50"/>
-              <w:right w:type="dxa" w:w="100"/>
-            </w:tcMar>
-            <w:vAlign w:val="center"/>
-          </w:tcPr>
-          <w:p>
-            <w:pPr>
-              <w:keepNext/>
-              <w:spacing w:after="0" w:line="252"/>
-              <w:jc w:val="center"/>
-            </w:pPr>
-          </w:p>
-        </w:tc>
-        <w:tc>
-          <w:tcPr>
-            <w:tcW w:type="dxa" w:w="5687"/>
+            <w:tcW w:type="dxa" w:w="1359"/>
+            <w:tcMar>
+              <w:top w:type="dxa" w:w="50"/>
+              <w:left w:type="dxa" w:w="100"/>
+              <w:bottom w:type="dxa" w:w="50"/>
+              <w:right w:type="dxa" w:w="100"/>
+            </w:tcMar>
+            <w:vAlign w:val="center"/>
+          </w:tcPr>
+          <w:p>
+            <w:pPr>
+              <w:keepNext/>
+              <w:spacing w:after="0" w:line="252"/>
+              <w:jc w:val="center"/>
+            </w:pPr>
+          </w:p>
+        </w:tc>
+        <w:tc>
+          <w:tcPr>
+            <w:tcW w:type="dxa" w:w="7291"/>
             <w:tcMar>
               <w:top w:type="dxa" w:w="50"/>
               <w:left w:type="dxa" w:w="100"/>
@@ -11456,7 +10675,7 @@
         </w:trPr>
         <w:tc>
           <w:tcPr>
-            <w:tcW w:type="dxa" w:w="771"/>
+            <w:tcW w:type="dxa" w:w="988"/>
             <w:tcMar>
               <w:top w:type="dxa" w:w="50"/>
               <w:left w:type="dxa" w:w="100"/>
@@ -11484,64 +10703,26 @@
         </w:tc>
         <w:tc>
           <w:tcPr>
-            <w:tcW w:type="dxa" w:w="867"/>
-            <w:tcMar>
-              <w:top w:type="dxa" w:w="50"/>
-              <w:left w:type="dxa" w:w="100"/>
-              <w:bottom w:type="dxa" w:w="50"/>
-              <w:right w:type="dxa" w:w="100"/>
-            </w:tcMar>
-            <w:vAlign w:val="center"/>
-          </w:tcPr>
-          <w:p>
-            <w:pPr>
-              <w:keepNext/>
-              <w:spacing w:after="0" w:line="252"/>
-              <w:jc w:val="center"/>
-            </w:pPr>
-          </w:p>
-        </w:tc>
-        <w:tc>
-          <w:tcPr>
-            <w:tcW w:type="dxa" w:w="1253"/>
-            <w:tcMar>
-              <w:top w:type="dxa" w:w="50"/>
-              <w:left w:type="dxa" w:w="100"/>
-              <w:bottom w:type="dxa" w:w="50"/>
-              <w:right w:type="dxa" w:w="100"/>
-            </w:tcMar>
-            <w:vAlign w:val="center"/>
-          </w:tcPr>
-          <w:p>
-            <w:pPr>
-              <w:keepNext/>
-              <w:spacing w:after="0" w:line="252"/>
-              <w:jc w:val="center"/>
-            </w:pPr>
-          </w:p>
-        </w:tc>
-        <w:tc>
-          <w:tcPr>
-            <w:tcW w:type="dxa" w:w="1060"/>
-            <w:tcMar>
-              <w:top w:type="dxa" w:w="50"/>
-              <w:left w:type="dxa" w:w="100"/>
-              <w:bottom w:type="dxa" w:w="50"/>
-              <w:right w:type="dxa" w:w="100"/>
-            </w:tcMar>
-            <w:vAlign w:val="center"/>
-          </w:tcPr>
-          <w:p>
-            <w:pPr>
-              <w:keepNext/>
-              <w:spacing w:after="0" w:line="252"/>
-              <w:jc w:val="center"/>
-            </w:pPr>
-          </w:p>
-        </w:tc>
-        <w:tc>
-          <w:tcPr>
-            <w:tcW w:type="dxa" w:w="5687"/>
+            <w:tcW w:type="dxa" w:w="1359"/>
+            <w:tcMar>
+              <w:top w:type="dxa" w:w="50"/>
+              <w:left w:type="dxa" w:w="100"/>
+              <w:bottom w:type="dxa" w:w="50"/>
+              <w:right w:type="dxa" w:w="100"/>
+            </w:tcMar>
+            <w:vAlign w:val="center"/>
+          </w:tcPr>
+          <w:p>
+            <w:pPr>
+              <w:keepNext/>
+              <w:spacing w:after="0" w:line="252"/>
+              <w:jc w:val="center"/>
+            </w:pPr>
+          </w:p>
+        </w:tc>
+        <w:tc>
+          <w:tcPr>
+            <w:tcW w:type="dxa" w:w="7291"/>
             <w:tcMar>
               <w:top w:type="dxa" w:w="50"/>
               <w:left w:type="dxa" w:w="100"/>
@@ -11566,7 +10747,7 @@
         </w:trPr>
         <w:tc>
           <w:tcPr>
-            <w:tcW w:type="dxa" w:w="771"/>
+            <w:tcW w:type="dxa" w:w="988"/>
             <w:tcMar>
               <w:top w:type="dxa" w:w="50"/>
               <w:left w:type="dxa" w:w="100"/>
@@ -11594,64 +10775,26 @@
         </w:tc>
         <w:tc>
           <w:tcPr>
-            <w:tcW w:type="dxa" w:w="867"/>
-            <w:tcMar>
-              <w:top w:type="dxa" w:w="50"/>
-              <w:left w:type="dxa" w:w="100"/>
-              <w:bottom w:type="dxa" w:w="50"/>
-              <w:right w:type="dxa" w:w="100"/>
-            </w:tcMar>
-            <w:vAlign w:val="center"/>
-          </w:tcPr>
-          <w:p>
-            <w:pPr>
-              <w:keepNext/>
-              <w:spacing w:after="0" w:line="252"/>
-              <w:jc w:val="center"/>
-            </w:pPr>
-          </w:p>
-        </w:tc>
-        <w:tc>
-          <w:tcPr>
-            <w:tcW w:type="dxa" w:w="1253"/>
-            <w:tcMar>
-              <w:top w:type="dxa" w:w="50"/>
-              <w:left w:type="dxa" w:w="100"/>
-              <w:bottom w:type="dxa" w:w="50"/>
-              <w:right w:type="dxa" w:w="100"/>
-            </w:tcMar>
-            <w:vAlign w:val="center"/>
-          </w:tcPr>
-          <w:p>
-            <w:pPr>
-              <w:keepNext/>
-              <w:spacing w:after="0" w:line="252"/>
-              <w:jc w:val="center"/>
-            </w:pPr>
-          </w:p>
-        </w:tc>
-        <w:tc>
-          <w:tcPr>
-            <w:tcW w:type="dxa" w:w="1060"/>
-            <w:tcMar>
-              <w:top w:type="dxa" w:w="50"/>
-              <w:left w:type="dxa" w:w="100"/>
-              <w:bottom w:type="dxa" w:w="50"/>
-              <w:right w:type="dxa" w:w="100"/>
-            </w:tcMar>
-            <w:vAlign w:val="center"/>
-          </w:tcPr>
-          <w:p>
-            <w:pPr>
-              <w:keepNext/>
-              <w:spacing w:after="0" w:line="252"/>
-              <w:jc w:val="center"/>
-            </w:pPr>
-          </w:p>
-        </w:tc>
-        <w:tc>
-          <w:tcPr>
-            <w:tcW w:type="dxa" w:w="5687"/>
+            <w:tcW w:type="dxa" w:w="1359"/>
+            <w:tcMar>
+              <w:top w:type="dxa" w:w="50"/>
+              <w:left w:type="dxa" w:w="100"/>
+              <w:bottom w:type="dxa" w:w="50"/>
+              <w:right w:type="dxa" w:w="100"/>
+            </w:tcMar>
+            <w:vAlign w:val="center"/>
+          </w:tcPr>
+          <w:p>
+            <w:pPr>
+              <w:keepNext/>
+              <w:spacing w:after="0" w:line="252"/>
+              <w:jc w:val="center"/>
+            </w:pPr>
+          </w:p>
+        </w:tc>
+        <w:tc>
+          <w:tcPr>
+            <w:tcW w:type="dxa" w:w="7291"/>
             <w:tcMar>
               <w:top w:type="dxa" w:w="50"/>
               <w:left w:type="dxa" w:w="100"/>
@@ -11676,7 +10819,7 @@
         </w:trPr>
         <w:tc>
           <w:tcPr>
-            <w:tcW w:type="dxa" w:w="771"/>
+            <w:tcW w:type="dxa" w:w="988"/>
             <w:tcMar>
               <w:top w:type="dxa" w:w="50"/>
               <w:left w:type="dxa" w:w="100"/>
@@ -11704,64 +10847,26 @@
         </w:tc>
         <w:tc>
           <w:tcPr>
-            <w:tcW w:type="dxa" w:w="867"/>
-            <w:tcMar>
-              <w:top w:type="dxa" w:w="50"/>
-              <w:left w:type="dxa" w:w="100"/>
-              <w:bottom w:type="dxa" w:w="50"/>
-              <w:right w:type="dxa" w:w="100"/>
-            </w:tcMar>
-            <w:vAlign w:val="center"/>
-          </w:tcPr>
-          <w:p>
-            <w:pPr>
-              <w:keepNext/>
-              <w:spacing w:after="0" w:line="252"/>
-              <w:jc w:val="center"/>
-            </w:pPr>
-          </w:p>
-        </w:tc>
-        <w:tc>
-          <w:tcPr>
-            <w:tcW w:type="dxa" w:w="1253"/>
-            <w:tcMar>
-              <w:top w:type="dxa" w:w="50"/>
-              <w:left w:type="dxa" w:w="100"/>
-              <w:bottom w:type="dxa" w:w="50"/>
-              <w:right w:type="dxa" w:w="100"/>
-            </w:tcMar>
-            <w:vAlign w:val="center"/>
-          </w:tcPr>
-          <w:p>
-            <w:pPr>
-              <w:keepNext/>
-              <w:spacing w:after="0" w:line="252"/>
-              <w:jc w:val="center"/>
-            </w:pPr>
-          </w:p>
-        </w:tc>
-        <w:tc>
-          <w:tcPr>
-            <w:tcW w:type="dxa" w:w="1060"/>
-            <w:tcMar>
-              <w:top w:type="dxa" w:w="50"/>
-              <w:left w:type="dxa" w:w="100"/>
-              <w:bottom w:type="dxa" w:w="50"/>
-              <w:right w:type="dxa" w:w="100"/>
-            </w:tcMar>
-            <w:vAlign w:val="center"/>
-          </w:tcPr>
-          <w:p>
-            <w:pPr>
-              <w:keepNext/>
-              <w:spacing w:after="0" w:line="252"/>
-              <w:jc w:val="center"/>
-            </w:pPr>
-          </w:p>
-        </w:tc>
-        <w:tc>
-          <w:tcPr>
-            <w:tcW w:type="dxa" w:w="5687"/>
+            <w:tcW w:type="dxa" w:w="1359"/>
+            <w:tcMar>
+              <w:top w:type="dxa" w:w="50"/>
+              <w:left w:type="dxa" w:w="100"/>
+              <w:bottom w:type="dxa" w:w="50"/>
+              <w:right w:type="dxa" w:w="100"/>
+            </w:tcMar>
+            <w:vAlign w:val="center"/>
+          </w:tcPr>
+          <w:p>
+            <w:pPr>
+              <w:keepNext/>
+              <w:spacing w:after="0" w:line="252"/>
+              <w:jc w:val="center"/>
+            </w:pPr>
+          </w:p>
+        </w:tc>
+        <w:tc>
+          <w:tcPr>
+            <w:tcW w:type="dxa" w:w="7291"/>
             <w:tcMar>
               <w:top w:type="dxa" w:w="50"/>
               <w:left w:type="dxa" w:w="100"/>
@@ -11786,7 +10891,7 @@
         </w:trPr>
         <w:tc>
           <w:tcPr>
-            <w:tcW w:type="dxa" w:w="771"/>
+            <w:tcW w:type="dxa" w:w="988"/>
             <w:tcMar>
               <w:top w:type="dxa" w:w="50"/>
               <w:left w:type="dxa" w:w="100"/>
@@ -11814,64 +10919,26 @@
         </w:tc>
         <w:tc>
           <w:tcPr>
-            <w:tcW w:type="dxa" w:w="867"/>
-            <w:tcMar>
-              <w:top w:type="dxa" w:w="50"/>
-              <w:left w:type="dxa" w:w="100"/>
-              <w:bottom w:type="dxa" w:w="50"/>
-              <w:right w:type="dxa" w:w="100"/>
-            </w:tcMar>
-            <w:vAlign w:val="center"/>
-          </w:tcPr>
-          <w:p>
-            <w:pPr>
-              <w:keepNext/>
-              <w:spacing w:after="0" w:line="252"/>
-              <w:jc w:val="center"/>
-            </w:pPr>
-          </w:p>
-        </w:tc>
-        <w:tc>
-          <w:tcPr>
-            <w:tcW w:type="dxa" w:w="1253"/>
-            <w:tcMar>
-              <w:top w:type="dxa" w:w="50"/>
-              <w:left w:type="dxa" w:w="100"/>
-              <w:bottom w:type="dxa" w:w="50"/>
-              <w:right w:type="dxa" w:w="100"/>
-            </w:tcMar>
-            <w:vAlign w:val="center"/>
-          </w:tcPr>
-          <w:p>
-            <w:pPr>
-              <w:keepNext/>
-              <w:spacing w:after="0" w:line="252"/>
-              <w:jc w:val="center"/>
-            </w:pPr>
-          </w:p>
-        </w:tc>
-        <w:tc>
-          <w:tcPr>
-            <w:tcW w:type="dxa" w:w="1060"/>
-            <w:tcMar>
-              <w:top w:type="dxa" w:w="50"/>
-              <w:left w:type="dxa" w:w="100"/>
-              <w:bottom w:type="dxa" w:w="50"/>
-              <w:right w:type="dxa" w:w="100"/>
-            </w:tcMar>
-            <w:vAlign w:val="center"/>
-          </w:tcPr>
-          <w:p>
-            <w:pPr>
-              <w:keepNext/>
-              <w:spacing w:after="0" w:line="252"/>
-              <w:jc w:val="center"/>
-            </w:pPr>
-          </w:p>
-        </w:tc>
-        <w:tc>
-          <w:tcPr>
-            <w:tcW w:type="dxa" w:w="5687"/>
+            <w:tcW w:type="dxa" w:w="1359"/>
+            <w:tcMar>
+              <w:top w:type="dxa" w:w="50"/>
+              <w:left w:type="dxa" w:w="100"/>
+              <w:bottom w:type="dxa" w:w="50"/>
+              <w:right w:type="dxa" w:w="100"/>
+            </w:tcMar>
+            <w:vAlign w:val="center"/>
+          </w:tcPr>
+          <w:p>
+            <w:pPr>
+              <w:keepNext/>
+              <w:spacing w:after="0" w:line="252"/>
+              <w:jc w:val="center"/>
+            </w:pPr>
+          </w:p>
+        </w:tc>
+        <w:tc>
+          <w:tcPr>
+            <w:tcW w:type="dxa" w:w="7291"/>
             <w:tcMar>
               <w:top w:type="dxa" w:w="50"/>
               <w:left w:type="dxa" w:w="100"/>
@@ -11896,7 +10963,7 @@
         </w:trPr>
         <w:tc>
           <w:tcPr>
-            <w:tcW w:type="dxa" w:w="771"/>
+            <w:tcW w:type="dxa" w:w="988"/>
             <w:tcMar>
               <w:top w:type="dxa" w:w="50"/>
               <w:left w:type="dxa" w:w="100"/>
@@ -11924,7 +10991,7 @@
         </w:tc>
         <w:tc>
           <w:tcPr>
-            <w:tcW w:type="dxa" w:w="867"/>
+            <w:tcW w:type="dxa" w:w="1359"/>
             <w:tcMar>
               <w:top w:type="dxa" w:w="50"/>
               <w:left w:type="dxa" w:w="100"/>
@@ -11943,45 +11010,7 @@
         </w:tc>
         <w:tc>
           <w:tcPr>
-            <w:tcW w:type="dxa" w:w="1253"/>
-            <w:tcMar>
-              <w:top w:type="dxa" w:w="50"/>
-              <w:left w:type="dxa" w:w="100"/>
-              <w:bottom w:type="dxa" w:w="50"/>
-              <w:right w:type="dxa" w:w="100"/>
-            </w:tcMar>
-            <w:vAlign w:val="center"/>
-          </w:tcPr>
-          <w:p>
-            <w:pPr>
-              <w:keepNext w:val="false"/>
-              <w:spacing w:after="0" w:line="252"/>
-              <w:jc w:val="center"/>
-            </w:pPr>
-          </w:p>
-        </w:tc>
-        <w:tc>
-          <w:tcPr>
-            <w:tcW w:type="dxa" w:w="1060"/>
-            <w:tcMar>
-              <w:top w:type="dxa" w:w="50"/>
-              <w:left w:type="dxa" w:w="100"/>
-              <w:bottom w:type="dxa" w:w="50"/>
-              <w:right w:type="dxa" w:w="100"/>
-            </w:tcMar>
-            <w:vAlign w:val="center"/>
-          </w:tcPr>
-          <w:p>
-            <w:pPr>
-              <w:keepNext w:val="false"/>
-              <w:spacing w:after="0" w:line="252"/>
-              <w:jc w:val="center"/>
-            </w:pPr>
-          </w:p>
-        </w:tc>
-        <w:tc>
-          <w:tcPr>
-            <w:tcW w:type="dxa" w:w="5687"/>
+            <w:tcW w:type="dxa" w:w="7291"/>
             <w:tcMar>
               <w:top w:type="dxa" w:w="50"/>
               <w:left w:type="dxa" w:w="100"/>

</xml_diff>